<commit_message>
Consolidate to ONE memory.md at /home/ubuntu/ and add CHANGE_LOG_ADDITION.md
- DELETED memory.md from project dir (was duplicate)
- CANONICAL location is now /home/ubuntu/memory.md (only copy)
- Consolidated unique items from old memory.md:
  * SSH port 22 info
  * QB process names (qbw.exe, QBW32.exe)
  * QB 2021 32-bit exe path (QBW32PremierAccountant.exe)
  * Notepad-as-intercom rule
  * One-QB-at-a-time rule
  * Stay-within-AIAgent-profile rule
  * Sequential workflow rule
  * Joshs Gold Coast password (was 'See PASSWORDS.txt', now explicit)
- Added CHANGE_LOG_ADDITION.md to supplemental files list
- Added DEBUGGING_SUMMARY_FOR_JOSEPH.md to supplemental files list
- Added debugging_review_report.md to supplemental files list
- Updated PROJECT_INSTRUCTIONS.md:
  * Points to /home/ubuntu/memory.md (not project dir)
  * All 6 supplemental files listed with cat commands
  * Clear 'NOT the project dir!' warning
</commit_message>
<xml_diff>
--- a/PATH_REFERENCE.docx
+++ b/PATH_REFERENCE.docx
@@ -1707,15 +1707,23 @@
         <w:t xml:space="preserve">Old Names → New Names (Rename History)</w:t>
       </w:r>
     </w:p>
+    <w:p>
+      <w:pPr>
+        <w:pStyle w:val="FirstParagraph"/>
+      </w:pPr>
+      <w:r>
+        <w:t xml:space="preserve">Renamed on 2026-05-19 — all spaces replaced with underscores for path compatibility.</w:t>
+      </w:r>
+    </w:p>
     <w:tbl>
       <w:tblPr>
         <w:tblStyle w:val="Table"/>
-        <w:tblW w:type="auto" w:w="0"/>
+        <w:tblW w:type="pct" w:w="5000"/>
         <w:tblLook w:firstRow="1" w:lastRow="0" w:firstColumn="0" w:lastColumn="0" w:noHBand="0" w:noVBand="0" w:val="0020"/>
       </w:tblPr>
       <w:tblGrid>
-        <w:gridCol w:w="3960"/>
-        <w:gridCol w:w="3960"/>
+        <w:gridCol w:w="4132"/>
+        <w:gridCol w:w="3787"/>
       </w:tblGrid>
       <w:tr>
         <w:trPr>
@@ -1729,19 +1737,19 @@
               <w:jc w:val="left"/>
             </w:pPr>
             <w:r>
-              <w:t xml:space="preserve">Old Name (with spaces)</w:t>
-            </w:r>
-          </w:p>
-        </w:tc>
-        <w:tc>
-          <w:tcPr/>
-          <w:p>
-            <w:pPr>
-              <w:pStyle w:val="Compact"/>
-              <w:jc w:val="left"/>
-            </w:pPr>
-            <w:r>
-              <w:t xml:space="preserve">New Name (underscores)</w:t>
+              <w:t xml:space="preserve">Old Path (with spaces)</w:t>
+            </w:r>
+          </w:p>
+        </w:tc>
+        <w:tc>
+          <w:tcPr/>
+          <w:p>
+            <w:pPr>
+              <w:pStyle w:val="Compact"/>
+              <w:jc w:val="left"/>
+            </w:pPr>
+            <w:r>
+              <w:t xml:space="preserve">New Path (underscores)</w:t>
             </w:r>
           </w:p>
         </w:tc>
@@ -1758,7 +1766,7 @@
               <w:rPr>
                 <w:rStyle w:val="VerbatimChar"/>
               </w:rPr>
-              <w:t xml:space="preserve">Joshua's Gold Coast</w:t>
+              <w:t xml:space="preserve">Desktop\Joshs Gold Coast\joshs gold coast ii 23.qbw</w:t>
             </w:r>
           </w:p>
         </w:tc>
@@ -1773,7 +1781,7 @@
               <w:rPr>
                 <w:rStyle w:val="VerbatimChar"/>
               </w:rPr>
-              <w:t xml:space="preserve">Joshs_Gold_Coast</w:t>
+              <w:t xml:space="preserve">C:\Users\AIAgent\Desktop\Joshs_Gold_Coast\Joshs_Gold_Coast_II_2023.qbw</w:t>
             </w:r>
           </w:p>
         </w:tc>
@@ -1790,7 +1798,7 @@
               <w:rPr>
                 <w:rStyle w:val="VerbatimChar"/>
               </w:rPr>
-              <w:t xml:space="preserve">Blank Template</w:t>
+              <w:t xml:space="preserve">Desktop\Air Masters\Air Masters QB 2023.qbw</w:t>
             </w:r>
           </w:p>
         </w:tc>
@@ -1805,7 +1813,7 @@
               <w:rPr>
                 <w:rStyle w:val="VerbatimChar"/>
               </w:rPr>
-              <w:t xml:space="preserve">QB21_Blank_Template</w:t>
+              <w:t xml:space="preserve">C:\Users\AIAgent\Desktop\Air_Masters\Air_Masters_QB_2023.qbw</w:t>
             </w:r>
           </w:p>
         </w:tc>
@@ -1822,7 +1830,7 @@
               <w:rPr>
                 <w:rStyle w:val="VerbatimChar"/>
               </w:rPr>
-              <w:t xml:space="preserve">Air Masters</w:t>
+              <w:t xml:space="preserve">Desktop\QB21 Blank Template\Blank Template.qbw</w:t>
             </w:r>
           </w:p>
         </w:tc>
@@ -1837,39 +1845,7 @@
               <w:rPr>
                 <w:rStyle w:val="VerbatimChar"/>
               </w:rPr>
-              <w:t xml:space="preserve">Air_Masters</w:t>
-            </w:r>
-          </w:p>
-        </w:tc>
-      </w:tr>
-      <w:tr>
-        <w:tc>
-          <w:tcPr/>
-          <w:p>
-            <w:pPr>
-              <w:pStyle w:val="Compact"/>
-              <w:jc w:val="left"/>
-            </w:pPr>
-            <w:r>
-              <w:rPr>
-                <w:rStyle w:val="VerbatimChar"/>
-              </w:rPr>
-              <w:t xml:space="preserve">Air-Masters-QB-2023.qbw</w:t>
-            </w:r>
-          </w:p>
-        </w:tc>
-        <w:tc>
-          <w:tcPr/>
-          <w:p>
-            <w:pPr>
-              <w:pStyle w:val="Compact"/>
-              <w:jc w:val="left"/>
-            </w:pPr>
-            <w:r>
-              <w:rPr>
-                <w:rStyle w:val="VerbatimChar"/>
-              </w:rPr>
-              <w:t xml:space="preserve">Air_Masters_QB_2023.qbw</w:t>
+              <w:t xml:space="preserve">C:\Users\AIAgent\Desktop\QB21_Blank_Template\Blank_Template.qbw</w:t>
             </w:r>
           </w:p>
         </w:tc>

</xml_diff>